<commit_message>
refactor: word dosyası düzenlendi
</commit_message>
<xml_diff>
--- a/docs/Bi-LSTM Kademeli Savunma Sistemi — Sonuç Raporu.docx
+++ b/docs/Bi-LSTM Kademeli Savunma Sistemi — Sonuç Raporu.docx
@@ -1091,6 +1091,1012 @@
         <w:t>Türkçe ve çok dilli injection saldırılarına karşı genelleme test edilmemiştir.</w:t>
       </w:r>
     </w:p>
+    <w:p>
+      <w:pPr>
+        <w:rPr>
+          <w:b/>
+          <w:bCs/>
+        </w:rPr>
+      </w:pPr>
+      <w:r>
+        <w:rPr>
+          <w:b/>
+          <w:bCs/>
+        </w:rPr>
+        <w:t>Son Durum Raporu</w:t>
+      </w:r>
+    </w:p>
+    <w:p>
+      <w:r>
+        <w:t>Mevcut Sonuçlar</w:t>
+      </w:r>
+    </w:p>
+    <w:tbl>
+      <w:tblPr>
+        <w:tblW w:w="0" w:type="auto"/>
+        <w:tblBorders>
+          <w:top w:val="single" w:sz="4" w:space="0" w:color="2A2B2C"/>
+          <w:left w:val="single" w:sz="4" w:space="0" w:color="2A2B2C"/>
+          <w:bottom w:val="single" w:sz="4" w:space="0" w:color="2A2B2C"/>
+          <w:right w:val="single" w:sz="4" w:space="0" w:color="2A2B2C"/>
+        </w:tblBorders>
+        <w:shd w:val="clear" w:color="auto" w:fill="191A1B"/>
+        <w:tblCellMar>
+          <w:top w:w="15" w:type="dxa"/>
+          <w:left w:w="15" w:type="dxa"/>
+          <w:bottom w:w="15" w:type="dxa"/>
+          <w:right w:w="15" w:type="dxa"/>
+        </w:tblCellMar>
+        <w:tblLook w:val="04A0" w:firstRow="1" w:lastRow="0" w:firstColumn="1" w:lastColumn="0" w:noHBand="0" w:noVBand="1"/>
+      </w:tblPr>
+      <w:tblGrid>
+        <w:gridCol w:w="2241"/>
+        <w:gridCol w:w="712"/>
+      </w:tblGrid>
+      <w:tr>
+        <w:trPr>
+          <w:tblHeader/>
+        </w:trPr>
+        <w:tc>
+          <w:tcPr>
+            <w:tcW w:w="0" w:type="auto"/>
+            <w:tcBorders>
+              <w:top w:val="single" w:sz="4" w:space="0" w:color="2A2B2C"/>
+              <w:left w:val="single" w:sz="4" w:space="0" w:color="2A2B2C"/>
+              <w:bottom w:val="single" w:sz="4" w:space="0" w:color="2A2B2C"/>
+              <w:right w:val="single" w:sz="4" w:space="0" w:color="2A2B2C"/>
+            </w:tcBorders>
+            <w:shd w:val="clear" w:color="auto" w:fill="191A1B"/>
+            <w:tcMar>
+              <w:top w:w="30" w:type="dxa"/>
+              <w:left w:w="30" w:type="dxa"/>
+              <w:bottom w:w="30" w:type="dxa"/>
+              <w:right w:w="30" w:type="dxa"/>
+            </w:tcMar>
+            <w:vAlign w:val="center"/>
+            <w:hideMark/>
+          </w:tcPr>
+          <w:p>
+            <w:pPr>
+              <w:rPr>
+                <w:b/>
+                <w:bCs/>
+              </w:rPr>
+            </w:pPr>
+            <w:r>
+              <w:rPr>
+                <w:b/>
+                <w:bCs/>
+              </w:rPr>
+              <w:t>Metrik</w:t>
+            </w:r>
+          </w:p>
+        </w:tc>
+        <w:tc>
+          <w:tcPr>
+            <w:tcW w:w="0" w:type="auto"/>
+            <w:tcBorders>
+              <w:top w:val="single" w:sz="4" w:space="0" w:color="2A2B2C"/>
+              <w:left w:val="single" w:sz="4" w:space="0" w:color="2A2B2C"/>
+              <w:bottom w:val="single" w:sz="4" w:space="0" w:color="2A2B2C"/>
+              <w:right w:val="single" w:sz="4" w:space="0" w:color="2A2B2C"/>
+            </w:tcBorders>
+            <w:shd w:val="clear" w:color="auto" w:fill="191A1B"/>
+            <w:tcMar>
+              <w:top w:w="30" w:type="dxa"/>
+              <w:left w:w="30" w:type="dxa"/>
+              <w:bottom w:w="30" w:type="dxa"/>
+              <w:right w:w="30" w:type="dxa"/>
+            </w:tcMar>
+            <w:vAlign w:val="center"/>
+            <w:hideMark/>
+          </w:tcPr>
+          <w:p>
+            <w:pPr>
+              <w:rPr>
+                <w:b/>
+                <w:bCs/>
+              </w:rPr>
+            </w:pPr>
+            <w:r>
+              <w:rPr>
+                <w:b/>
+                <w:bCs/>
+              </w:rPr>
+              <w:t>Değer</w:t>
+            </w:r>
+          </w:p>
+        </w:tc>
+      </w:tr>
+      <w:tr>
+        <w:tc>
+          <w:tcPr>
+            <w:tcW w:w="0" w:type="auto"/>
+            <w:tcBorders>
+              <w:top w:val="single" w:sz="4" w:space="0" w:color="2A2B2C"/>
+              <w:left w:val="single" w:sz="4" w:space="0" w:color="2A2B2C"/>
+              <w:bottom w:val="single" w:sz="4" w:space="0" w:color="2A2B2C"/>
+              <w:right w:val="single" w:sz="4" w:space="0" w:color="2A2B2C"/>
+            </w:tcBorders>
+            <w:shd w:val="clear" w:color="auto" w:fill="191A1B"/>
+            <w:tcMar>
+              <w:top w:w="30" w:type="dxa"/>
+              <w:left w:w="30" w:type="dxa"/>
+              <w:bottom w:w="30" w:type="dxa"/>
+              <w:right w:w="30" w:type="dxa"/>
+            </w:tcMar>
+            <w:vAlign w:val="center"/>
+            <w:hideMark/>
+          </w:tcPr>
+          <w:p>
+            <w:r>
+              <w:t>Val Accuracy</w:t>
+            </w:r>
+          </w:p>
+        </w:tc>
+        <w:tc>
+          <w:tcPr>
+            <w:tcW w:w="0" w:type="auto"/>
+            <w:tcBorders>
+              <w:top w:val="single" w:sz="4" w:space="0" w:color="2A2B2C"/>
+              <w:left w:val="single" w:sz="4" w:space="0" w:color="2A2B2C"/>
+              <w:bottom w:val="single" w:sz="4" w:space="0" w:color="2A2B2C"/>
+              <w:right w:val="single" w:sz="4" w:space="0" w:color="2A2B2C"/>
+            </w:tcBorders>
+            <w:shd w:val="clear" w:color="auto" w:fill="191A1B"/>
+            <w:tcMar>
+              <w:top w:w="30" w:type="dxa"/>
+              <w:left w:w="30" w:type="dxa"/>
+              <w:bottom w:w="30" w:type="dxa"/>
+              <w:right w:w="30" w:type="dxa"/>
+            </w:tcMar>
+            <w:vAlign w:val="center"/>
+            <w:hideMark/>
+          </w:tcPr>
+          <w:p>
+            <w:r>
+              <w:t>%94.2</w:t>
+            </w:r>
+          </w:p>
+        </w:tc>
+      </w:tr>
+      <w:tr>
+        <w:tc>
+          <w:tcPr>
+            <w:tcW w:w="0" w:type="auto"/>
+            <w:tcBorders>
+              <w:top w:val="single" w:sz="4" w:space="0" w:color="2A2B2C"/>
+              <w:left w:val="single" w:sz="4" w:space="0" w:color="2A2B2C"/>
+              <w:bottom w:val="single" w:sz="4" w:space="0" w:color="2A2B2C"/>
+              <w:right w:val="single" w:sz="4" w:space="0" w:color="2A2B2C"/>
+            </w:tcBorders>
+            <w:shd w:val="clear" w:color="auto" w:fill="191A1B"/>
+            <w:tcMar>
+              <w:top w:w="30" w:type="dxa"/>
+              <w:left w:w="30" w:type="dxa"/>
+              <w:bottom w:w="30" w:type="dxa"/>
+              <w:right w:w="30" w:type="dxa"/>
+            </w:tcMar>
+            <w:vAlign w:val="center"/>
+            <w:hideMark/>
+          </w:tcPr>
+          <w:p>
+            <w:r>
+              <w:t>OOD F1</w:t>
+            </w:r>
+          </w:p>
+        </w:tc>
+        <w:tc>
+          <w:tcPr>
+            <w:tcW w:w="0" w:type="auto"/>
+            <w:tcBorders>
+              <w:top w:val="single" w:sz="4" w:space="0" w:color="2A2B2C"/>
+              <w:left w:val="single" w:sz="4" w:space="0" w:color="2A2B2C"/>
+              <w:bottom w:val="single" w:sz="4" w:space="0" w:color="2A2B2C"/>
+              <w:right w:val="single" w:sz="4" w:space="0" w:color="2A2B2C"/>
+            </w:tcBorders>
+            <w:shd w:val="clear" w:color="auto" w:fill="191A1B"/>
+            <w:tcMar>
+              <w:top w:w="30" w:type="dxa"/>
+              <w:left w:w="30" w:type="dxa"/>
+              <w:bottom w:w="30" w:type="dxa"/>
+              <w:right w:w="30" w:type="dxa"/>
+            </w:tcMar>
+            <w:vAlign w:val="center"/>
+            <w:hideMark/>
+          </w:tcPr>
+          <w:p>
+            <w:r>
+              <w:t>0.841</w:t>
+            </w:r>
+          </w:p>
+        </w:tc>
+      </w:tr>
+      <w:tr>
+        <w:tc>
+          <w:tcPr>
+            <w:tcW w:w="0" w:type="auto"/>
+            <w:tcBorders>
+              <w:top w:val="single" w:sz="4" w:space="0" w:color="2A2B2C"/>
+              <w:left w:val="single" w:sz="4" w:space="0" w:color="2A2B2C"/>
+              <w:bottom w:val="single" w:sz="4" w:space="0" w:color="2A2B2C"/>
+              <w:right w:val="single" w:sz="4" w:space="0" w:color="2A2B2C"/>
+            </w:tcBorders>
+            <w:shd w:val="clear" w:color="auto" w:fill="191A1B"/>
+            <w:tcMar>
+              <w:top w:w="30" w:type="dxa"/>
+              <w:left w:w="30" w:type="dxa"/>
+              <w:bottom w:w="30" w:type="dxa"/>
+              <w:right w:w="30" w:type="dxa"/>
+            </w:tcMar>
+            <w:vAlign w:val="center"/>
+            <w:hideMark/>
+          </w:tcPr>
+          <w:p>
+            <w:r>
+              <w:t>OOD Precision</w:t>
+            </w:r>
+          </w:p>
+        </w:tc>
+        <w:tc>
+          <w:tcPr>
+            <w:tcW w:w="0" w:type="auto"/>
+            <w:tcBorders>
+              <w:top w:val="single" w:sz="4" w:space="0" w:color="2A2B2C"/>
+              <w:left w:val="single" w:sz="4" w:space="0" w:color="2A2B2C"/>
+              <w:bottom w:val="single" w:sz="4" w:space="0" w:color="2A2B2C"/>
+              <w:right w:val="single" w:sz="4" w:space="0" w:color="2A2B2C"/>
+            </w:tcBorders>
+            <w:shd w:val="clear" w:color="auto" w:fill="191A1B"/>
+            <w:tcMar>
+              <w:top w:w="30" w:type="dxa"/>
+              <w:left w:w="30" w:type="dxa"/>
+              <w:bottom w:w="30" w:type="dxa"/>
+              <w:right w:w="30" w:type="dxa"/>
+            </w:tcMar>
+            <w:vAlign w:val="center"/>
+            <w:hideMark/>
+          </w:tcPr>
+          <w:p>
+            <w:r>
+              <w:t>0.957</w:t>
+            </w:r>
+          </w:p>
+        </w:tc>
+      </w:tr>
+      <w:tr>
+        <w:tc>
+          <w:tcPr>
+            <w:tcW w:w="0" w:type="auto"/>
+            <w:tcBorders>
+              <w:top w:val="single" w:sz="4" w:space="0" w:color="2A2B2C"/>
+              <w:left w:val="single" w:sz="4" w:space="0" w:color="2A2B2C"/>
+              <w:bottom w:val="single" w:sz="4" w:space="0" w:color="2A2B2C"/>
+              <w:right w:val="single" w:sz="4" w:space="0" w:color="2A2B2C"/>
+            </w:tcBorders>
+            <w:shd w:val="clear" w:color="auto" w:fill="191A1B"/>
+            <w:tcMar>
+              <w:top w:w="30" w:type="dxa"/>
+              <w:left w:w="30" w:type="dxa"/>
+              <w:bottom w:w="30" w:type="dxa"/>
+              <w:right w:w="30" w:type="dxa"/>
+            </w:tcMar>
+            <w:vAlign w:val="center"/>
+            <w:hideMark/>
+          </w:tcPr>
+          <w:p>
+            <w:r>
+              <w:t>OOD Recall</w:t>
+            </w:r>
+          </w:p>
+        </w:tc>
+        <w:tc>
+          <w:tcPr>
+            <w:tcW w:w="0" w:type="auto"/>
+            <w:tcBorders>
+              <w:top w:val="single" w:sz="4" w:space="0" w:color="2A2B2C"/>
+              <w:left w:val="single" w:sz="4" w:space="0" w:color="2A2B2C"/>
+              <w:bottom w:val="single" w:sz="4" w:space="0" w:color="2A2B2C"/>
+              <w:right w:val="single" w:sz="4" w:space="0" w:color="2A2B2C"/>
+            </w:tcBorders>
+            <w:shd w:val="clear" w:color="auto" w:fill="191A1B"/>
+            <w:tcMar>
+              <w:top w:w="30" w:type="dxa"/>
+              <w:left w:w="30" w:type="dxa"/>
+              <w:bottom w:w="30" w:type="dxa"/>
+              <w:right w:w="30" w:type="dxa"/>
+            </w:tcMar>
+            <w:vAlign w:val="center"/>
+            <w:hideMark/>
+          </w:tcPr>
+          <w:p>
+            <w:r>
+              <w:t>0.750</w:t>
+            </w:r>
+          </w:p>
+        </w:tc>
+      </w:tr>
+      <w:tr>
+        <w:tc>
+          <w:tcPr>
+            <w:tcW w:w="0" w:type="auto"/>
+            <w:tcBorders>
+              <w:top w:val="single" w:sz="4" w:space="0" w:color="2A2B2C"/>
+              <w:left w:val="single" w:sz="4" w:space="0" w:color="2A2B2C"/>
+              <w:bottom w:val="single" w:sz="4" w:space="0" w:color="2A2B2C"/>
+              <w:right w:val="single" w:sz="4" w:space="0" w:color="2A2B2C"/>
+            </w:tcBorders>
+            <w:shd w:val="clear" w:color="auto" w:fill="191A1B"/>
+            <w:tcMar>
+              <w:top w:w="30" w:type="dxa"/>
+              <w:left w:w="30" w:type="dxa"/>
+              <w:bottom w:w="30" w:type="dxa"/>
+              <w:right w:w="30" w:type="dxa"/>
+            </w:tcMar>
+            <w:vAlign w:val="center"/>
+            <w:hideMark/>
+          </w:tcPr>
+          <w:p>
+            <w:r>
+              <w:t>OOD FPR</w:t>
+            </w:r>
+          </w:p>
+        </w:tc>
+        <w:tc>
+          <w:tcPr>
+            <w:tcW w:w="0" w:type="auto"/>
+            <w:tcBorders>
+              <w:top w:val="single" w:sz="4" w:space="0" w:color="2A2B2C"/>
+              <w:left w:val="single" w:sz="4" w:space="0" w:color="2A2B2C"/>
+              <w:bottom w:val="single" w:sz="4" w:space="0" w:color="2A2B2C"/>
+              <w:right w:val="single" w:sz="4" w:space="0" w:color="2A2B2C"/>
+            </w:tcBorders>
+            <w:shd w:val="clear" w:color="auto" w:fill="191A1B"/>
+            <w:tcMar>
+              <w:top w:w="30" w:type="dxa"/>
+              <w:left w:w="30" w:type="dxa"/>
+              <w:bottom w:w="30" w:type="dxa"/>
+              <w:right w:w="30" w:type="dxa"/>
+            </w:tcMar>
+            <w:vAlign w:val="center"/>
+            <w:hideMark/>
+          </w:tcPr>
+          <w:p>
+            <w:r>
+              <w:t>0.036</w:t>
+            </w:r>
+          </w:p>
+        </w:tc>
+      </w:tr>
+      <w:tr>
+        <w:tc>
+          <w:tcPr>
+            <w:tcW w:w="0" w:type="auto"/>
+            <w:tcBorders>
+              <w:top w:val="single" w:sz="4" w:space="0" w:color="2A2B2C"/>
+              <w:left w:val="single" w:sz="4" w:space="0" w:color="2A2B2C"/>
+              <w:bottom w:val="single" w:sz="4" w:space="0" w:color="2A2B2C"/>
+              <w:right w:val="single" w:sz="4" w:space="0" w:color="2A2B2C"/>
+            </w:tcBorders>
+            <w:shd w:val="clear" w:color="auto" w:fill="191A1B"/>
+            <w:tcMar>
+              <w:top w:w="30" w:type="dxa"/>
+              <w:left w:w="30" w:type="dxa"/>
+              <w:bottom w:w="30" w:type="dxa"/>
+              <w:right w:w="30" w:type="dxa"/>
+            </w:tcMar>
+            <w:vAlign w:val="center"/>
+            <w:hideMark/>
+          </w:tcPr>
+          <w:p>
+            <w:r>
+              <w:t>ASR (bilstm-defense)</w:t>
+            </w:r>
+          </w:p>
+        </w:tc>
+        <w:tc>
+          <w:tcPr>
+            <w:tcW w:w="0" w:type="auto"/>
+            <w:tcBorders>
+              <w:top w:val="single" w:sz="4" w:space="0" w:color="2A2B2C"/>
+              <w:left w:val="single" w:sz="4" w:space="0" w:color="2A2B2C"/>
+              <w:bottom w:val="single" w:sz="4" w:space="0" w:color="2A2B2C"/>
+              <w:right w:val="single" w:sz="4" w:space="0" w:color="2A2B2C"/>
+            </w:tcBorders>
+            <w:shd w:val="clear" w:color="auto" w:fill="191A1B"/>
+            <w:tcMar>
+              <w:top w:w="30" w:type="dxa"/>
+              <w:left w:w="30" w:type="dxa"/>
+              <w:bottom w:w="30" w:type="dxa"/>
+              <w:right w:w="30" w:type="dxa"/>
+            </w:tcMar>
+            <w:vAlign w:val="center"/>
+            <w:hideMark/>
+          </w:tcPr>
+          <w:p>
+            <w:r>
+              <w:t>%0.0</w:t>
+            </w:r>
+          </w:p>
+        </w:tc>
+      </w:tr>
+      <w:tr>
+        <w:tc>
+          <w:tcPr>
+            <w:tcW w:w="0" w:type="auto"/>
+            <w:tcBorders>
+              <w:top w:val="single" w:sz="4" w:space="0" w:color="2A2B2C"/>
+              <w:left w:val="single" w:sz="4" w:space="0" w:color="2A2B2C"/>
+              <w:bottom w:val="single" w:sz="4" w:space="0" w:color="2A2B2C"/>
+              <w:right w:val="single" w:sz="4" w:space="0" w:color="2A2B2C"/>
+            </w:tcBorders>
+            <w:shd w:val="clear" w:color="auto" w:fill="191A1B"/>
+            <w:tcMar>
+              <w:top w:w="30" w:type="dxa"/>
+              <w:left w:w="30" w:type="dxa"/>
+              <w:bottom w:w="30" w:type="dxa"/>
+              <w:right w:w="30" w:type="dxa"/>
+            </w:tcMar>
+            <w:vAlign w:val="center"/>
+            <w:hideMark/>
+          </w:tcPr>
+          <w:p>
+            <w:r>
+              <w:t>Win-Rate</w:t>
+            </w:r>
+          </w:p>
+        </w:tc>
+        <w:tc>
+          <w:tcPr>
+            <w:tcW w:w="0" w:type="auto"/>
+            <w:tcBorders>
+              <w:top w:val="single" w:sz="4" w:space="0" w:color="2A2B2C"/>
+              <w:left w:val="single" w:sz="4" w:space="0" w:color="2A2B2C"/>
+              <w:bottom w:val="single" w:sz="4" w:space="0" w:color="2A2B2C"/>
+              <w:right w:val="single" w:sz="4" w:space="0" w:color="2A2B2C"/>
+            </w:tcBorders>
+            <w:shd w:val="clear" w:color="auto" w:fill="191A1B"/>
+            <w:tcMar>
+              <w:top w:w="30" w:type="dxa"/>
+              <w:left w:w="30" w:type="dxa"/>
+              <w:bottom w:w="30" w:type="dxa"/>
+              <w:right w:w="30" w:type="dxa"/>
+            </w:tcMar>
+            <w:vAlign w:val="center"/>
+            <w:hideMark/>
+          </w:tcPr>
+          <w:p>
+            <w:r>
+              <w:t>%36.2</w:t>
+            </w:r>
+          </w:p>
+        </w:tc>
+      </w:tr>
+      <w:tr>
+        <w:tc>
+          <w:tcPr>
+            <w:tcW w:w="0" w:type="auto"/>
+            <w:tcBorders>
+              <w:top w:val="single" w:sz="4" w:space="0" w:color="2A2B2C"/>
+              <w:left w:val="single" w:sz="4" w:space="0" w:color="2A2B2C"/>
+              <w:bottom w:val="single" w:sz="4" w:space="0" w:color="2A2B2C"/>
+              <w:right w:val="single" w:sz="4" w:space="0" w:color="2A2B2C"/>
+            </w:tcBorders>
+            <w:shd w:val="clear" w:color="auto" w:fill="191A1B"/>
+            <w:tcMar>
+              <w:top w:w="30" w:type="dxa"/>
+              <w:left w:w="30" w:type="dxa"/>
+              <w:bottom w:w="30" w:type="dxa"/>
+              <w:right w:w="30" w:type="dxa"/>
+            </w:tcMar>
+            <w:vAlign w:val="center"/>
+            <w:hideMark/>
+          </w:tcPr>
+          <w:p>
+            <w:r>
+              <w:t>GCG-ASR</w:t>
+            </w:r>
+          </w:p>
+        </w:tc>
+        <w:tc>
+          <w:tcPr>
+            <w:tcW w:w="0" w:type="auto"/>
+            <w:tcBorders>
+              <w:top w:val="single" w:sz="4" w:space="0" w:color="2A2B2C"/>
+              <w:left w:val="single" w:sz="4" w:space="0" w:color="2A2B2C"/>
+              <w:bottom w:val="single" w:sz="4" w:space="0" w:color="2A2B2C"/>
+              <w:right w:val="single" w:sz="4" w:space="0" w:color="2A2B2C"/>
+            </w:tcBorders>
+            <w:shd w:val="clear" w:color="auto" w:fill="191A1B"/>
+            <w:tcMar>
+              <w:top w:w="30" w:type="dxa"/>
+              <w:left w:w="30" w:type="dxa"/>
+              <w:bottom w:w="30" w:type="dxa"/>
+              <w:right w:w="30" w:type="dxa"/>
+            </w:tcMar>
+            <w:vAlign w:val="center"/>
+            <w:hideMark/>
+          </w:tcPr>
+          <w:p>
+            <w:r>
+              <w:t>%0.0</w:t>
+            </w:r>
+          </w:p>
+        </w:tc>
+      </w:tr>
+    </w:tbl>
+    <w:p/>
+    <w:p>
+      <w:r>
+        <w:t>Eğitim Verisi</w:t>
+      </w:r>
+    </w:p>
+    <w:tbl>
+      <w:tblPr>
+        <w:tblW w:w="0" w:type="auto"/>
+        <w:tblBorders>
+          <w:top w:val="single" w:sz="4" w:space="0" w:color="2A2B2C"/>
+          <w:left w:val="single" w:sz="4" w:space="0" w:color="2A2B2C"/>
+          <w:bottom w:val="single" w:sz="4" w:space="0" w:color="2A2B2C"/>
+          <w:right w:val="single" w:sz="4" w:space="0" w:color="2A2B2C"/>
+        </w:tblBorders>
+        <w:shd w:val="clear" w:color="auto" w:fill="191A1B"/>
+        <w:tblCellMar>
+          <w:top w:w="15" w:type="dxa"/>
+          <w:left w:w="15" w:type="dxa"/>
+          <w:bottom w:w="15" w:type="dxa"/>
+          <w:right w:w="15" w:type="dxa"/>
+        </w:tblCellMar>
+        <w:tblLook w:val="04A0" w:firstRow="1" w:lastRow="0" w:firstColumn="1" w:lastColumn="0" w:noHBand="0" w:noVBand="1"/>
+      </w:tblPr>
+      <w:tblGrid>
+        <w:gridCol w:w="1655"/>
+        <w:gridCol w:w="1017"/>
+      </w:tblGrid>
+      <w:tr>
+        <w:trPr>
+          <w:tblHeader/>
+        </w:trPr>
+        <w:tc>
+          <w:tcPr>
+            <w:tcW w:w="0" w:type="auto"/>
+            <w:tcBorders>
+              <w:top w:val="single" w:sz="4" w:space="0" w:color="2A2B2C"/>
+              <w:left w:val="single" w:sz="4" w:space="0" w:color="2A2B2C"/>
+              <w:bottom w:val="single" w:sz="4" w:space="0" w:color="2A2B2C"/>
+              <w:right w:val="single" w:sz="4" w:space="0" w:color="2A2B2C"/>
+            </w:tcBorders>
+            <w:shd w:val="clear" w:color="auto" w:fill="191A1B"/>
+            <w:tcMar>
+              <w:top w:w="30" w:type="dxa"/>
+              <w:left w:w="30" w:type="dxa"/>
+              <w:bottom w:w="30" w:type="dxa"/>
+              <w:right w:w="30" w:type="dxa"/>
+            </w:tcMar>
+            <w:vAlign w:val="center"/>
+            <w:hideMark/>
+          </w:tcPr>
+          <w:p>
+            <w:pPr>
+              <w:rPr>
+                <w:b/>
+                <w:bCs/>
+              </w:rPr>
+            </w:pPr>
+            <w:r>
+              <w:rPr>
+                <w:b/>
+                <w:bCs/>
+              </w:rPr>
+              <w:t>Dataset</w:t>
+            </w:r>
+          </w:p>
+        </w:tc>
+        <w:tc>
+          <w:tcPr>
+            <w:tcW w:w="0" w:type="auto"/>
+            <w:tcBorders>
+              <w:top w:val="single" w:sz="4" w:space="0" w:color="2A2B2C"/>
+              <w:left w:val="single" w:sz="4" w:space="0" w:color="2A2B2C"/>
+              <w:bottom w:val="single" w:sz="4" w:space="0" w:color="2A2B2C"/>
+              <w:right w:val="single" w:sz="4" w:space="0" w:color="2A2B2C"/>
+            </w:tcBorders>
+            <w:shd w:val="clear" w:color="auto" w:fill="191A1B"/>
+            <w:tcMar>
+              <w:top w:w="30" w:type="dxa"/>
+              <w:left w:w="30" w:type="dxa"/>
+              <w:bottom w:w="30" w:type="dxa"/>
+              <w:right w:w="30" w:type="dxa"/>
+            </w:tcMar>
+            <w:vAlign w:val="center"/>
+            <w:hideMark/>
+          </w:tcPr>
+          <w:p>
+            <w:pPr>
+              <w:rPr>
+                <w:b/>
+                <w:bCs/>
+              </w:rPr>
+            </w:pPr>
+            <w:r>
+              <w:rPr>
+                <w:b/>
+                <w:bCs/>
+              </w:rPr>
+              <w:t>Örnekler</w:t>
+            </w:r>
+          </w:p>
+        </w:tc>
+      </w:tr>
+      <w:tr>
+        <w:tc>
+          <w:tcPr>
+            <w:tcW w:w="0" w:type="auto"/>
+            <w:tcBorders>
+              <w:top w:val="single" w:sz="4" w:space="0" w:color="2A2B2C"/>
+              <w:left w:val="single" w:sz="4" w:space="0" w:color="2A2B2C"/>
+              <w:bottom w:val="single" w:sz="4" w:space="0" w:color="2A2B2C"/>
+              <w:right w:val="single" w:sz="4" w:space="0" w:color="2A2B2C"/>
+            </w:tcBorders>
+            <w:shd w:val="clear" w:color="auto" w:fill="191A1B"/>
+            <w:tcMar>
+              <w:top w:w="30" w:type="dxa"/>
+              <w:left w:w="30" w:type="dxa"/>
+              <w:bottom w:w="30" w:type="dxa"/>
+              <w:right w:w="30" w:type="dxa"/>
+            </w:tcMar>
+            <w:vAlign w:val="center"/>
+            <w:hideMark/>
+          </w:tcPr>
+          <w:p>
+            <w:r>
+              <w:t>Alpaca sentetik</w:t>
+            </w:r>
+          </w:p>
+        </w:tc>
+        <w:tc>
+          <w:tcPr>
+            <w:tcW w:w="0" w:type="auto"/>
+            <w:tcBorders>
+              <w:top w:val="single" w:sz="4" w:space="0" w:color="2A2B2C"/>
+              <w:left w:val="single" w:sz="4" w:space="0" w:color="2A2B2C"/>
+              <w:bottom w:val="single" w:sz="4" w:space="0" w:color="2A2B2C"/>
+              <w:right w:val="single" w:sz="4" w:space="0" w:color="2A2B2C"/>
+            </w:tcBorders>
+            <w:shd w:val="clear" w:color="auto" w:fill="191A1B"/>
+            <w:tcMar>
+              <w:top w:w="30" w:type="dxa"/>
+              <w:left w:w="30" w:type="dxa"/>
+              <w:bottom w:w="30" w:type="dxa"/>
+              <w:right w:w="30" w:type="dxa"/>
+            </w:tcMar>
+            <w:vAlign w:val="center"/>
+            <w:hideMark/>
+          </w:tcPr>
+          <w:p>
+            <w:r>
+              <w:t>~624</w:t>
+            </w:r>
+          </w:p>
+        </w:tc>
+      </w:tr>
+      <w:tr>
+        <w:tc>
+          <w:tcPr>
+            <w:tcW w:w="0" w:type="auto"/>
+            <w:tcBorders>
+              <w:top w:val="single" w:sz="4" w:space="0" w:color="2A2B2C"/>
+              <w:left w:val="single" w:sz="4" w:space="0" w:color="2A2B2C"/>
+              <w:bottom w:val="single" w:sz="4" w:space="0" w:color="2A2B2C"/>
+              <w:right w:val="single" w:sz="4" w:space="0" w:color="2A2B2C"/>
+            </w:tcBorders>
+            <w:shd w:val="clear" w:color="auto" w:fill="191A1B"/>
+            <w:tcMar>
+              <w:top w:w="30" w:type="dxa"/>
+              <w:left w:w="30" w:type="dxa"/>
+              <w:bottom w:w="30" w:type="dxa"/>
+              <w:right w:w="30" w:type="dxa"/>
+            </w:tcMar>
+            <w:vAlign w:val="center"/>
+            <w:hideMark/>
+          </w:tcPr>
+          <w:p>
+            <w:r>
+              <w:lastRenderedPageBreak/>
+              <w:t>deepset train</w:t>
+            </w:r>
+          </w:p>
+        </w:tc>
+        <w:tc>
+          <w:tcPr>
+            <w:tcW w:w="0" w:type="auto"/>
+            <w:tcBorders>
+              <w:top w:val="single" w:sz="4" w:space="0" w:color="2A2B2C"/>
+              <w:left w:val="single" w:sz="4" w:space="0" w:color="2A2B2C"/>
+              <w:bottom w:val="single" w:sz="4" w:space="0" w:color="2A2B2C"/>
+              <w:right w:val="single" w:sz="4" w:space="0" w:color="2A2B2C"/>
+            </w:tcBorders>
+            <w:shd w:val="clear" w:color="auto" w:fill="191A1B"/>
+            <w:tcMar>
+              <w:top w:w="30" w:type="dxa"/>
+              <w:left w:w="30" w:type="dxa"/>
+              <w:bottom w:w="30" w:type="dxa"/>
+              <w:right w:w="30" w:type="dxa"/>
+            </w:tcMar>
+            <w:vAlign w:val="center"/>
+            <w:hideMark/>
+          </w:tcPr>
+          <w:p>
+            <w:r>
+              <w:t>546</w:t>
+            </w:r>
+          </w:p>
+        </w:tc>
+      </w:tr>
+      <w:tr>
+        <w:tc>
+          <w:tcPr>
+            <w:tcW w:w="0" w:type="auto"/>
+            <w:tcBorders>
+              <w:top w:val="single" w:sz="4" w:space="0" w:color="2A2B2C"/>
+              <w:left w:val="single" w:sz="4" w:space="0" w:color="2A2B2C"/>
+              <w:bottom w:val="single" w:sz="4" w:space="0" w:color="2A2B2C"/>
+              <w:right w:val="single" w:sz="4" w:space="0" w:color="2A2B2C"/>
+            </w:tcBorders>
+            <w:shd w:val="clear" w:color="auto" w:fill="191A1B"/>
+            <w:tcMar>
+              <w:top w:w="30" w:type="dxa"/>
+              <w:left w:w="30" w:type="dxa"/>
+              <w:bottom w:w="30" w:type="dxa"/>
+              <w:right w:w="30" w:type="dxa"/>
+            </w:tcMar>
+            <w:vAlign w:val="center"/>
+            <w:hideMark/>
+          </w:tcPr>
+          <w:p>
+            <w:r>
+              <w:t>rogue-security</w:t>
+            </w:r>
+          </w:p>
+        </w:tc>
+        <w:tc>
+          <w:tcPr>
+            <w:tcW w:w="0" w:type="auto"/>
+            <w:tcBorders>
+              <w:top w:val="single" w:sz="4" w:space="0" w:color="2A2B2C"/>
+              <w:left w:val="single" w:sz="4" w:space="0" w:color="2A2B2C"/>
+              <w:bottom w:val="single" w:sz="4" w:space="0" w:color="2A2B2C"/>
+              <w:right w:val="single" w:sz="4" w:space="0" w:color="2A2B2C"/>
+            </w:tcBorders>
+            <w:shd w:val="clear" w:color="auto" w:fill="191A1B"/>
+            <w:tcMar>
+              <w:top w:w="30" w:type="dxa"/>
+              <w:left w:w="30" w:type="dxa"/>
+              <w:bottom w:w="30" w:type="dxa"/>
+              <w:right w:w="30" w:type="dxa"/>
+            </w:tcMar>
+            <w:vAlign w:val="center"/>
+            <w:hideMark/>
+          </w:tcPr>
+          <w:p>
+            <w:r>
+              <w:t>5.000</w:t>
+            </w:r>
+          </w:p>
+        </w:tc>
+      </w:tr>
+      <w:tr>
+        <w:tc>
+          <w:tcPr>
+            <w:tcW w:w="0" w:type="auto"/>
+            <w:tcBorders>
+              <w:top w:val="single" w:sz="4" w:space="0" w:color="2A2B2C"/>
+              <w:left w:val="single" w:sz="4" w:space="0" w:color="2A2B2C"/>
+              <w:bottom w:val="single" w:sz="4" w:space="0" w:color="2A2B2C"/>
+              <w:right w:val="single" w:sz="4" w:space="0" w:color="2A2B2C"/>
+            </w:tcBorders>
+            <w:shd w:val="clear" w:color="auto" w:fill="191A1B"/>
+            <w:tcMar>
+              <w:top w:w="30" w:type="dxa"/>
+              <w:left w:w="30" w:type="dxa"/>
+              <w:bottom w:w="30" w:type="dxa"/>
+              <w:right w:w="30" w:type="dxa"/>
+            </w:tcMar>
+            <w:vAlign w:val="center"/>
+            <w:hideMark/>
+          </w:tcPr>
+          <w:p>
+            <w:r>
+              <w:t>HackAPrompt</w:t>
+            </w:r>
+          </w:p>
+        </w:tc>
+        <w:tc>
+          <w:tcPr>
+            <w:tcW w:w="0" w:type="auto"/>
+            <w:tcBorders>
+              <w:top w:val="single" w:sz="4" w:space="0" w:color="2A2B2C"/>
+              <w:left w:val="single" w:sz="4" w:space="0" w:color="2A2B2C"/>
+              <w:bottom w:val="single" w:sz="4" w:space="0" w:color="2A2B2C"/>
+              <w:right w:val="single" w:sz="4" w:space="0" w:color="2A2B2C"/>
+            </w:tcBorders>
+            <w:shd w:val="clear" w:color="auto" w:fill="191A1B"/>
+            <w:tcMar>
+              <w:top w:w="30" w:type="dxa"/>
+              <w:left w:w="30" w:type="dxa"/>
+              <w:bottom w:w="30" w:type="dxa"/>
+              <w:right w:w="30" w:type="dxa"/>
+            </w:tcMar>
+            <w:vAlign w:val="center"/>
+            <w:hideMark/>
+          </w:tcPr>
+          <w:p>
+            <w:r>
+              <w:t>10.000</w:t>
+            </w:r>
+          </w:p>
+        </w:tc>
+      </w:tr>
+      <w:tr>
+        <w:tc>
+          <w:tcPr>
+            <w:tcW w:w="0" w:type="auto"/>
+            <w:tcBorders>
+              <w:top w:val="single" w:sz="4" w:space="0" w:color="2A2B2C"/>
+              <w:left w:val="single" w:sz="4" w:space="0" w:color="2A2B2C"/>
+              <w:bottom w:val="single" w:sz="4" w:space="0" w:color="2A2B2C"/>
+              <w:right w:val="single" w:sz="4" w:space="0" w:color="2A2B2C"/>
+            </w:tcBorders>
+            <w:shd w:val="clear" w:color="auto" w:fill="191A1B"/>
+            <w:tcMar>
+              <w:top w:w="30" w:type="dxa"/>
+              <w:left w:w="30" w:type="dxa"/>
+              <w:bottom w:w="30" w:type="dxa"/>
+              <w:right w:w="30" w:type="dxa"/>
+            </w:tcMar>
+            <w:vAlign w:val="center"/>
+            <w:hideMark/>
+          </w:tcPr>
+          <w:p>
+            <w:r>
+              <w:rPr>
+                <w:b/>
+                <w:bCs/>
+              </w:rPr>
+              <w:t>Toplam</w:t>
+            </w:r>
+          </w:p>
+        </w:tc>
+        <w:tc>
+          <w:tcPr>
+            <w:tcW w:w="0" w:type="auto"/>
+            <w:tcBorders>
+              <w:top w:val="single" w:sz="4" w:space="0" w:color="2A2B2C"/>
+              <w:left w:val="single" w:sz="4" w:space="0" w:color="2A2B2C"/>
+              <w:bottom w:val="single" w:sz="4" w:space="0" w:color="2A2B2C"/>
+              <w:right w:val="single" w:sz="4" w:space="0" w:color="2A2B2C"/>
+            </w:tcBorders>
+            <w:shd w:val="clear" w:color="auto" w:fill="191A1B"/>
+            <w:tcMar>
+              <w:top w:w="30" w:type="dxa"/>
+              <w:left w:w="30" w:type="dxa"/>
+              <w:bottom w:w="30" w:type="dxa"/>
+              <w:right w:w="30" w:type="dxa"/>
+            </w:tcMar>
+            <w:vAlign w:val="center"/>
+            <w:hideMark/>
+          </w:tcPr>
+          <w:p>
+            <w:r>
+              <w:rPr>
+                <w:b/>
+                <w:bCs/>
+              </w:rPr>
+              <w:t>16.975</w:t>
+            </w:r>
+          </w:p>
+        </w:tc>
+      </w:tr>
+    </w:tbl>
+    <w:p/>
+    <w:p>
+      <w:r>
+        <w:rPr>
+          <w:b/>
+          <w:bCs/>
+        </w:rPr>
+        <w:t>Mevcut durumun güçlü yanları:</w:t>
+      </w:r>
+    </w:p>
+    <w:p>
+      <w:pPr>
+        <w:numPr>
+          <w:ilvl w:val="0"/>
+          <w:numId w:val="6"/>
+        </w:numPr>
+      </w:pPr>
+      <w:r>
+        <w:t>deepset test split eğitimde hiç kullanılmadı → gerçek OOD</w:t>
+      </w:r>
+    </w:p>
+    <w:p>
+      <w:pPr>
+        <w:numPr>
+          <w:ilvl w:val="0"/>
+          <w:numId w:val="6"/>
+        </w:numPr>
+      </w:pPr>
+      <w:r>
+        <w:t>60 injection + 56 temiz = dengeli</w:t>
+      </w:r>
+    </w:p>
+    <w:p>
+      <w:pPr>
+        <w:numPr>
+          <w:ilvl w:val="0"/>
+          <w:numId w:val="6"/>
+        </w:numPr>
+      </w:pPr>
+      <w:r>
+        <w:t>Sonuçlar tutarlı (birden fazla çalıştırmada aynı çıkıyor)</w:t>
+      </w:r>
+    </w:p>
+    <w:p>
+      <w:r>
+        <w:rPr>
+          <w:b/>
+          <w:bCs/>
+        </w:rPr>
+        <w:t>Zayıf yanları:</w:t>
+      </w:r>
+    </w:p>
+    <w:p>
+      <w:pPr>
+        <w:numPr>
+          <w:ilvl w:val="0"/>
+          <w:numId w:val="7"/>
+        </w:numPr>
+      </w:pPr>
+      <w:r>
+        <w:rPr>
+          <w:b/>
+          <w:bCs/>
+        </w:rPr>
+        <w:t>Sadece 116 örnek</w:t>
+      </w:r>
+      <w:r>
+        <w:t> — küçük örneklem, güven aralıkları geniş</w:t>
+      </w:r>
+    </w:p>
+    <w:p>
+      <w:pPr>
+        <w:numPr>
+          <w:ilvl w:val="0"/>
+          <w:numId w:val="7"/>
+        </w:numPr>
+      </w:pPr>
+      <w:r>
+        <w:rPr>
+          <w:b/>
+          <w:bCs/>
+        </w:rPr>
+        <w:t>Tek dataset</w:t>
+      </w:r>
+      <w:r>
+        <w:t> — deepset test split, deepset train split ile aynı dağılımdan geliyor. Gerçek OOD için tamamen farklı bir kaynak lazım</w:t>
+      </w:r>
+    </w:p>
+    <w:p>
+      <w:pPr>
+        <w:numPr>
+          <w:ilvl w:val="0"/>
+          <w:numId w:val="7"/>
+        </w:numPr>
+      </w:pPr>
+      <w:r>
+        <w:t>Eğitimde kullandığımız tüm datasetleri (rogue-security, HackAPrompt) artık OOD için kullanamıyoruz</w:t>
+      </w:r>
+    </w:p>
     <w:p/>
     <w:sectPr>
       <w:pgSz w:w="12240" w:h="15840"/>
@@ -1105,6 +2111,155 @@
 <file path=word/numbering.xml><?xml version="1.0" encoding="utf-8"?>
 <w:numbering xmlns:wpc="http://schemas.microsoft.com/office/word/2010/wordprocessingCanvas" xmlns:cx="http://schemas.microsoft.com/office/drawing/2014/chartex" xmlns:cx1="http://schemas.microsoft.com/office/drawing/2015/9/8/chartex" xmlns:cx2="http://schemas.microsoft.com/office/drawing/2015/10/21/chartex" xmlns:cx3="http://schemas.microsoft.com/office/drawing/2016/5/9/chartex" xmlns:cx4="http://schemas.microsoft.com/office/drawing/2016/5/10/chartex" xmlns:cx5="http://schemas.microsoft.com/office/drawing/2016/5/11/chartex" xmlns:cx6="http://schemas.microsoft.com/office/drawing/2016/5/12/chartex" xmlns:cx7="http://schemas.microsoft.com/office/drawing/2016/5/13/chartex" xmlns:cx8="http://schemas.microsoft.com/office/drawing/2016/5/14/chartex" xmlns:mc="http://schemas.openxmlformats.org/markup-compatibility/2006" xmlns:aink="http://schemas.microsoft.com/office/drawing/2016/ink" xmlns:am3d="http://schemas.microsoft.com/office/drawing/2017/model3d" xmlns:o="urn:schemas-microsoft-com:office:office" xmlns:oel="http://schemas.microsoft.com/office/2019/extlst" xmlns:r="http://schemas.openxmlformats.org/officeDocument/2006/relationships" xmlns:m="http://schemas.openxmlformats.org/officeDocument/2006/math" xmlns:v="urn:schemas-microsoft-com:vml" xmlns:wp14="http://schemas.microsoft.com/office/word/2010/wordprocessingDrawing" xmlns:wp="http://schemas.openxmlformats.org/drawingml/2006/wordprocessingDrawing" xmlns:w10="urn:schemas-microsoft-com:office:word" xmlns:w="http://schemas.openxmlformats.org/wordprocessingml/2006/main" xmlns:w14="http://schemas.microsoft.com/office/word/2010/wordml" xmlns:w15="http://schemas.microsoft.com/office/word/2012/wordml" xmlns:w16cex="http://schemas.microsoft.com/office/word/2018/wordml/cex" xmlns:w16cid="http://schemas.microsoft.com/office/word/2016/wordml/cid" xmlns:w16="http://schemas.microsoft.com/office/word/2018/wordml" xmlns:w16du="http://schemas.microsoft.com/office/word/2023/wordml/word16du" xmlns:w16sdtdh="http://schemas.microsoft.com/office/word/2020/wordml/sdtdatahash" xmlns:w16sdtfl="http://schemas.microsoft.com/office/word/2024/wordml/sdtformatlock" xmlns:w16se="http://schemas.microsoft.com/office/word/2015/wordml/symex" xmlns:wpg="http://schemas.microsoft.com/office/word/2010/wordprocessingGroup" xmlns:wpi="http://schemas.microsoft.com/office/word/2010/wordprocessingInk" xmlns:wne="http://schemas.microsoft.com/office/word/2006/wordml" xmlns:wps="http://schemas.microsoft.com/office/word/2010/wordprocessingShape" mc:Ignorable="w14 w15 w16se w16cid w16 w16cex w16sdtdh w16sdtfl w16du wp14">
   <w:abstractNum w:abstractNumId="0" w15:restartNumberingAfterBreak="0">
+    <w:nsid w:val="0394730F"/>
+    <w:multiLevelType w:val="multilevel"/>
+    <w:tmpl w:val="D332B0E2"/>
+    <w:lvl w:ilvl="0">
+      <w:start w:val="1"/>
+      <w:numFmt w:val="bullet"/>
+      <w:lvlText w:val=""/>
+      <w:lvlJc w:val="left"/>
+      <w:pPr>
+        <w:tabs>
+          <w:tab w:val="num" w:pos="720"/>
+        </w:tabs>
+        <w:ind w:left="720" w:hanging="360"/>
+      </w:pPr>
+      <w:rPr>
+        <w:rFonts w:ascii="Symbol" w:hAnsi="Symbol" w:hint="default"/>
+        <w:sz w:val="20"/>
+      </w:rPr>
+    </w:lvl>
+    <w:lvl w:ilvl="1" w:tentative="1">
+      <w:start w:val="1"/>
+      <w:numFmt w:val="bullet"/>
+      <w:lvlText w:val="o"/>
+      <w:lvlJc w:val="left"/>
+      <w:pPr>
+        <w:tabs>
+          <w:tab w:val="num" w:pos="1440"/>
+        </w:tabs>
+        <w:ind w:left="1440" w:hanging="360"/>
+      </w:pPr>
+      <w:rPr>
+        <w:rFonts w:ascii="Courier New" w:hAnsi="Courier New" w:hint="default"/>
+        <w:sz w:val="20"/>
+      </w:rPr>
+    </w:lvl>
+    <w:lvl w:ilvl="2" w:tentative="1">
+      <w:start w:val="1"/>
+      <w:numFmt w:val="bullet"/>
+      <w:lvlText w:val=""/>
+      <w:lvlJc w:val="left"/>
+      <w:pPr>
+        <w:tabs>
+          <w:tab w:val="num" w:pos="2160"/>
+        </w:tabs>
+        <w:ind w:left="2160" w:hanging="360"/>
+      </w:pPr>
+      <w:rPr>
+        <w:rFonts w:ascii="Wingdings" w:hAnsi="Wingdings" w:hint="default"/>
+        <w:sz w:val="20"/>
+      </w:rPr>
+    </w:lvl>
+    <w:lvl w:ilvl="3" w:tentative="1">
+      <w:start w:val="1"/>
+      <w:numFmt w:val="bullet"/>
+      <w:lvlText w:val=""/>
+      <w:lvlJc w:val="left"/>
+      <w:pPr>
+        <w:tabs>
+          <w:tab w:val="num" w:pos="2880"/>
+        </w:tabs>
+        <w:ind w:left="2880" w:hanging="360"/>
+      </w:pPr>
+      <w:rPr>
+        <w:rFonts w:ascii="Wingdings" w:hAnsi="Wingdings" w:hint="default"/>
+        <w:sz w:val="20"/>
+      </w:rPr>
+    </w:lvl>
+    <w:lvl w:ilvl="4" w:tentative="1">
+      <w:start w:val="1"/>
+      <w:numFmt w:val="bullet"/>
+      <w:lvlText w:val=""/>
+      <w:lvlJc w:val="left"/>
+      <w:pPr>
+        <w:tabs>
+          <w:tab w:val="num" w:pos="3600"/>
+        </w:tabs>
+        <w:ind w:left="3600" w:hanging="360"/>
+      </w:pPr>
+      <w:rPr>
+        <w:rFonts w:ascii="Wingdings" w:hAnsi="Wingdings" w:hint="default"/>
+        <w:sz w:val="20"/>
+      </w:rPr>
+    </w:lvl>
+    <w:lvl w:ilvl="5" w:tentative="1">
+      <w:start w:val="1"/>
+      <w:numFmt w:val="bullet"/>
+      <w:lvlText w:val=""/>
+      <w:lvlJc w:val="left"/>
+      <w:pPr>
+        <w:tabs>
+          <w:tab w:val="num" w:pos="4320"/>
+        </w:tabs>
+        <w:ind w:left="4320" w:hanging="360"/>
+      </w:pPr>
+      <w:rPr>
+        <w:rFonts w:ascii="Wingdings" w:hAnsi="Wingdings" w:hint="default"/>
+        <w:sz w:val="20"/>
+      </w:rPr>
+    </w:lvl>
+    <w:lvl w:ilvl="6" w:tentative="1">
+      <w:start w:val="1"/>
+      <w:numFmt w:val="bullet"/>
+      <w:lvlText w:val=""/>
+      <w:lvlJc w:val="left"/>
+      <w:pPr>
+        <w:tabs>
+          <w:tab w:val="num" w:pos="5040"/>
+        </w:tabs>
+        <w:ind w:left="5040" w:hanging="360"/>
+      </w:pPr>
+      <w:rPr>
+        <w:rFonts w:ascii="Wingdings" w:hAnsi="Wingdings" w:hint="default"/>
+        <w:sz w:val="20"/>
+      </w:rPr>
+    </w:lvl>
+    <w:lvl w:ilvl="7" w:tentative="1">
+      <w:start w:val="1"/>
+      <w:numFmt w:val="bullet"/>
+      <w:lvlText w:val=""/>
+      <w:lvlJc w:val="left"/>
+      <w:pPr>
+        <w:tabs>
+          <w:tab w:val="num" w:pos="5760"/>
+        </w:tabs>
+        <w:ind w:left="5760" w:hanging="360"/>
+      </w:pPr>
+      <w:rPr>
+        <w:rFonts w:ascii="Wingdings" w:hAnsi="Wingdings" w:hint="default"/>
+        <w:sz w:val="20"/>
+      </w:rPr>
+    </w:lvl>
+    <w:lvl w:ilvl="8" w:tentative="1">
+      <w:start w:val="1"/>
+      <w:numFmt w:val="bullet"/>
+      <w:lvlText w:val=""/>
+      <w:lvlJc w:val="left"/>
+      <w:pPr>
+        <w:tabs>
+          <w:tab w:val="num" w:pos="6480"/>
+        </w:tabs>
+        <w:ind w:left="6480" w:hanging="360"/>
+      </w:pPr>
+      <w:rPr>
+        <w:rFonts w:ascii="Wingdings" w:hAnsi="Wingdings" w:hint="default"/>
+        <w:sz w:val="20"/>
+      </w:rPr>
+    </w:lvl>
+  </w:abstractNum>
+  <w:abstractNum w:abstractNumId="1" w15:restartNumberingAfterBreak="0">
     <w:nsid w:val="0B1E2FD4"/>
     <w:multiLevelType w:val="multilevel"/>
     <w:tmpl w:val="3210090E"/>
@@ -1253,7 +2408,156 @@
       </w:rPr>
     </w:lvl>
   </w:abstractNum>
-  <w:abstractNum w:abstractNumId="1" w15:restartNumberingAfterBreak="0">
+  <w:abstractNum w:abstractNumId="2" w15:restartNumberingAfterBreak="0">
+    <w:nsid w:val="23616A2F"/>
+    <w:multiLevelType w:val="multilevel"/>
+    <w:tmpl w:val="B5447428"/>
+    <w:lvl w:ilvl="0">
+      <w:start w:val="1"/>
+      <w:numFmt w:val="bullet"/>
+      <w:lvlText w:val=""/>
+      <w:lvlJc w:val="left"/>
+      <w:pPr>
+        <w:tabs>
+          <w:tab w:val="num" w:pos="720"/>
+        </w:tabs>
+        <w:ind w:left="720" w:hanging="360"/>
+      </w:pPr>
+      <w:rPr>
+        <w:rFonts w:ascii="Symbol" w:hAnsi="Symbol" w:hint="default"/>
+        <w:sz w:val="20"/>
+      </w:rPr>
+    </w:lvl>
+    <w:lvl w:ilvl="1" w:tentative="1">
+      <w:start w:val="1"/>
+      <w:numFmt w:val="bullet"/>
+      <w:lvlText w:val="o"/>
+      <w:lvlJc w:val="left"/>
+      <w:pPr>
+        <w:tabs>
+          <w:tab w:val="num" w:pos="1440"/>
+        </w:tabs>
+        <w:ind w:left="1440" w:hanging="360"/>
+      </w:pPr>
+      <w:rPr>
+        <w:rFonts w:ascii="Courier New" w:hAnsi="Courier New" w:hint="default"/>
+        <w:sz w:val="20"/>
+      </w:rPr>
+    </w:lvl>
+    <w:lvl w:ilvl="2" w:tentative="1">
+      <w:start w:val="1"/>
+      <w:numFmt w:val="bullet"/>
+      <w:lvlText w:val=""/>
+      <w:lvlJc w:val="left"/>
+      <w:pPr>
+        <w:tabs>
+          <w:tab w:val="num" w:pos="2160"/>
+        </w:tabs>
+        <w:ind w:left="2160" w:hanging="360"/>
+      </w:pPr>
+      <w:rPr>
+        <w:rFonts w:ascii="Wingdings" w:hAnsi="Wingdings" w:hint="default"/>
+        <w:sz w:val="20"/>
+      </w:rPr>
+    </w:lvl>
+    <w:lvl w:ilvl="3" w:tentative="1">
+      <w:start w:val="1"/>
+      <w:numFmt w:val="bullet"/>
+      <w:lvlText w:val=""/>
+      <w:lvlJc w:val="left"/>
+      <w:pPr>
+        <w:tabs>
+          <w:tab w:val="num" w:pos="2880"/>
+        </w:tabs>
+        <w:ind w:left="2880" w:hanging="360"/>
+      </w:pPr>
+      <w:rPr>
+        <w:rFonts w:ascii="Wingdings" w:hAnsi="Wingdings" w:hint="default"/>
+        <w:sz w:val="20"/>
+      </w:rPr>
+    </w:lvl>
+    <w:lvl w:ilvl="4" w:tentative="1">
+      <w:start w:val="1"/>
+      <w:numFmt w:val="bullet"/>
+      <w:lvlText w:val=""/>
+      <w:lvlJc w:val="left"/>
+      <w:pPr>
+        <w:tabs>
+          <w:tab w:val="num" w:pos="3600"/>
+        </w:tabs>
+        <w:ind w:left="3600" w:hanging="360"/>
+      </w:pPr>
+      <w:rPr>
+        <w:rFonts w:ascii="Wingdings" w:hAnsi="Wingdings" w:hint="default"/>
+        <w:sz w:val="20"/>
+      </w:rPr>
+    </w:lvl>
+    <w:lvl w:ilvl="5" w:tentative="1">
+      <w:start w:val="1"/>
+      <w:numFmt w:val="bullet"/>
+      <w:lvlText w:val=""/>
+      <w:lvlJc w:val="left"/>
+      <w:pPr>
+        <w:tabs>
+          <w:tab w:val="num" w:pos="4320"/>
+        </w:tabs>
+        <w:ind w:left="4320" w:hanging="360"/>
+      </w:pPr>
+      <w:rPr>
+        <w:rFonts w:ascii="Wingdings" w:hAnsi="Wingdings" w:hint="default"/>
+        <w:sz w:val="20"/>
+      </w:rPr>
+    </w:lvl>
+    <w:lvl w:ilvl="6" w:tentative="1">
+      <w:start w:val="1"/>
+      <w:numFmt w:val="bullet"/>
+      <w:lvlText w:val=""/>
+      <w:lvlJc w:val="left"/>
+      <w:pPr>
+        <w:tabs>
+          <w:tab w:val="num" w:pos="5040"/>
+        </w:tabs>
+        <w:ind w:left="5040" w:hanging="360"/>
+      </w:pPr>
+      <w:rPr>
+        <w:rFonts w:ascii="Wingdings" w:hAnsi="Wingdings" w:hint="default"/>
+        <w:sz w:val="20"/>
+      </w:rPr>
+    </w:lvl>
+    <w:lvl w:ilvl="7" w:tentative="1">
+      <w:start w:val="1"/>
+      <w:numFmt w:val="bullet"/>
+      <w:lvlText w:val=""/>
+      <w:lvlJc w:val="left"/>
+      <w:pPr>
+        <w:tabs>
+          <w:tab w:val="num" w:pos="5760"/>
+        </w:tabs>
+        <w:ind w:left="5760" w:hanging="360"/>
+      </w:pPr>
+      <w:rPr>
+        <w:rFonts w:ascii="Wingdings" w:hAnsi="Wingdings" w:hint="default"/>
+        <w:sz w:val="20"/>
+      </w:rPr>
+    </w:lvl>
+    <w:lvl w:ilvl="8" w:tentative="1">
+      <w:start w:val="1"/>
+      <w:numFmt w:val="bullet"/>
+      <w:lvlText w:val=""/>
+      <w:lvlJc w:val="left"/>
+      <w:pPr>
+        <w:tabs>
+          <w:tab w:val="num" w:pos="6480"/>
+        </w:tabs>
+        <w:ind w:left="6480" w:hanging="360"/>
+      </w:pPr>
+      <w:rPr>
+        <w:rFonts w:ascii="Wingdings" w:hAnsi="Wingdings" w:hint="default"/>
+        <w:sz w:val="20"/>
+      </w:rPr>
+    </w:lvl>
+  </w:abstractNum>
+  <w:abstractNum w:abstractNumId="3" w15:restartNumberingAfterBreak="0">
     <w:nsid w:val="389A1D4E"/>
     <w:multiLevelType w:val="multilevel"/>
     <w:tmpl w:val="FF22655C"/>
@@ -1402,7 +2706,7 @@
       </w:rPr>
     </w:lvl>
   </w:abstractNum>
-  <w:abstractNum w:abstractNumId="2" w15:restartNumberingAfterBreak="0">
+  <w:abstractNum w:abstractNumId="4" w15:restartNumberingAfterBreak="0">
     <w:nsid w:val="42A2735E"/>
     <w:multiLevelType w:val="multilevel"/>
     <w:tmpl w:val="7EDE8244"/>
@@ -1551,7 +2855,7 @@
       </w:rPr>
     </w:lvl>
   </w:abstractNum>
-  <w:abstractNum w:abstractNumId="3" w15:restartNumberingAfterBreak="0">
+  <w:abstractNum w:abstractNumId="5" w15:restartNumberingAfterBreak="0">
     <w:nsid w:val="55ED1BC6"/>
     <w:multiLevelType w:val="multilevel"/>
     <w:tmpl w:val="6DF4B726"/>
@@ -1700,7 +3004,7 @@
       </w:rPr>
     </w:lvl>
   </w:abstractNum>
-  <w:abstractNum w:abstractNumId="4" w15:restartNumberingAfterBreak="0">
+  <w:abstractNum w:abstractNumId="6" w15:restartNumberingAfterBreak="0">
     <w:nsid w:val="6ABA225F"/>
     <w:multiLevelType w:val="multilevel"/>
     <w:tmpl w:val="8FF659BE"/>
@@ -1850,19 +3154,25 @@
     </w:lvl>
   </w:abstractNum>
   <w:num w:numId="1" w16cid:durableId="2001425206">
+    <w:abstractNumId w:val="4"/>
+  </w:num>
+  <w:num w:numId="2" w16cid:durableId="1503012715">
+    <w:abstractNumId w:val="1"/>
+  </w:num>
+  <w:num w:numId="3" w16cid:durableId="1788506395">
+    <w:abstractNumId w:val="3"/>
+  </w:num>
+  <w:num w:numId="4" w16cid:durableId="277493996">
+    <w:abstractNumId w:val="6"/>
+  </w:num>
+  <w:num w:numId="5" w16cid:durableId="1498381270">
+    <w:abstractNumId w:val="5"/>
+  </w:num>
+  <w:num w:numId="6" w16cid:durableId="1242788504">
     <w:abstractNumId w:val="2"/>
   </w:num>
-  <w:num w:numId="2" w16cid:durableId="1503012715">
+  <w:num w:numId="7" w16cid:durableId="1075709357">
     <w:abstractNumId w:val="0"/>
-  </w:num>
-  <w:num w:numId="3" w16cid:durableId="1788506395">
-    <w:abstractNumId w:val="1"/>
-  </w:num>
-  <w:num w:numId="4" w16cid:durableId="277493996">
-    <w:abstractNumId w:val="4"/>
-  </w:num>
-  <w:num w:numId="5" w16cid:durableId="1498381270">
-    <w:abstractNumId w:val="3"/>
   </w:num>
 </w:numbering>
 </file>

</xml_diff>